<commit_message>
Remove do kit a nota sobre o que ele não cobre
O parágrafo comparava o kit ao acordo anual e servia à decisão interna
da Contratante, não ao documento que as duas Partes manuseiam todo mês.

Co-Authored-By: Claude Opus 5 <noreply@anthropic.com>
Claude-Session: https://claude.ai/code/session_01JvuJwy7yY4EnoYMkQynCaG
</commit_message>
<xml_diff>
--- a/docs/juridico/kit-mensal-simplificado.docx
+++ b/docs/juridico/kit-mensal-simplificado.docx
@@ -2448,20 +2448,6 @@
         <w:t>Arquivar os quatro papéis juntos, numa pasta por competência: OS + nota + recibo + comprovante</w:t>
       </w:r>
     </w:p>
-    <w:p>
-      <w:r>
-        <w:rPr>
-          <w:b/>
-        </w:rPr>
-        <w:t>O que este kit não cobre</w:t>
-      </w:r>
-      <w:r>
-        <w:rPr>
-          <w:b w:val="0"/>
-        </w:rPr>
-        <w:t>, e que existia no acordo anual: aviso prévio de 60 dias para encerrar, multa por saída sem aviso, direito de regresso em caso de reclamação trabalhista, retenção de garantia, cláusula de sigilo e proteção de dados, e as regras sanitárias de alimentos e bebidas.</w:t>
-      </w:r>
-    </w:p>
     <w:sectPr>
       <w:footerReference w:type="default" r:id="rId9"/>
       <w:pgSz w:w="11906" w:h="16838"/>

</xml_diff>

<commit_message>
Simplifica o kit para dois documentos, sem penalidades
Reduz a estrutura ao essencial pedido: prestação mediante ordem de
serviço, com uso das instalações enquanto durar o trabalho.

- Termo único de uma página reúne serviços, horário, organização do
  trabalho, ausência de vínculo, equipe, valor, uso das instalações,
  cuidados com a unidade e encerramento.
- Ordem de Serviço e Recibo passam a ocupar uma só folha por mês.
- Removidas todas as penalidades: multa diária de atraso na devolução,
  multa por encerramento e retenção de garantia.
- Aviso de encerramento passa a ser de 30 dias para as duas Partes, com
  a devolução da unidade correndo em paralelo.

Co-Authored-By: Claude Opus 5 <noreply@anthropic.com>
Claude-Session: https://claude.ai/code/session_01JvuJwy7yY4EnoYMkQynCaG
</commit_message>
<xml_diff>
--- a/docs/juridico/kit-mensal-simplificado.docx
+++ b/docs/juridico/kit-mensal-simplificado.docx
@@ -14,7 +14,7 @@
           <w:color w:val="0A0A0A"/>
           <w:sz w:val="30"/>
         </w:rPr>
-        <w:t>KIT SIMPLIFICADO — PRESTAÇÃO DE SERVIÇOS MÊS A MÊS</w:t>
+        <w:t>PRESTAÇÃO DE SERVIÇOS — DOCUMENTOS</w:t>
       </w:r>
     </w:p>
     <w:p>
@@ -30,14 +30,6 @@
           <w:sz w:val="22"/>
         </w:rPr>
         <w:t>Mediterrâneo Empreendimentos Turísticos Ltda × 19.525.600 Camila Rabelo Glicerio Gois</w:t>
-      </w:r>
-    </w:p>
-    <w:p>
-      <w:r>
-        <w:rPr>
-          <w:b w:val="0"/>
-        </w:rPr>
-        <w:t>Três documentos curtos, de uma página cada:</w:t>
       </w:r>
     </w:p>
     <w:tbl>
@@ -175,7 +167,7 @@
                 <w:b/>
                 <w:sz w:val="18"/>
               </w:rPr>
-              <w:t>Termo de Cessão de Uso da Casa de Operações</w:t>
+              <w:t>Termo de Prestação de Serviços e Uso das Instalações</w:t>
             </w:r>
           </w:p>
         </w:tc>
@@ -206,13 +198,6 @@
                 <w:sz w:val="18"/>
               </w:rPr>
               <w:t>uma vez</w:t>
-            </w:r>
-            <w:r>
-              <w:rPr>
-                <w:b w:val="0"/>
-                <w:sz w:val="18"/>
-              </w:rPr>
-              <w:t>, e vale enquanto durar a prestação</w:t>
             </w:r>
           </w:p>
         </w:tc>
@@ -260,7 +245,7 @@
                 <w:b/>
                 <w:sz w:val="18"/>
               </w:rPr>
-              <w:t>Ordem de Serviço Mensal</w:t>
+              <w:t>Ordem de Serviço e Recibo</w:t>
             </w:r>
           </w:p>
         </w:tc>
@@ -283,106 +268,14 @@
                 <w:b w:val="0"/>
                 <w:sz w:val="18"/>
               </w:rPr>
-              <w:t xml:space="preserve">Emitida </w:t>
+              <w:t xml:space="preserve">Uma folha </w:t>
             </w:r>
             <w:r>
               <w:rPr>
                 <w:b/>
                 <w:sz w:val="18"/>
               </w:rPr>
-              <w:t>todo mês</w:t>
-            </w:r>
-            <w:r>
-              <w:rPr>
-                <w:b w:val="0"/>
-                <w:sz w:val="18"/>
-              </w:rPr>
-              <w:t>, no início do mês</w:t>
-            </w:r>
-          </w:p>
-        </w:tc>
-      </w:tr>
-      <w:tr>
-        <w:tc>
-          <w:tcPr>
-            <w:tcW w:type="dxa" w:w="2929"/>
-          </w:tcPr>
-          <w:p>
-            <w:pPr>
-              <w:spacing w:after="40"/>
-              <w:jc w:val="left"/>
-            </w:pPr>
-            <w:r>
-              <w:rPr>
-                <w:sz w:val="18"/>
-              </w:rPr>
-            </w:r>
-            <w:r>
-              <w:rPr>
-                <w:b w:val="0"/>
-                <w:sz w:val="18"/>
-              </w:rPr>
-              <w:t>3</w:t>
-            </w:r>
-          </w:p>
-        </w:tc>
-        <w:tc>
-          <w:tcPr>
-            <w:tcW w:type="dxa" w:w="2929"/>
-          </w:tcPr>
-          <w:p>
-            <w:pPr>
-              <w:spacing w:after="40"/>
-              <w:jc w:val="left"/>
-            </w:pPr>
-            <w:r>
-              <w:rPr>
-                <w:sz w:val="18"/>
-              </w:rPr>
-            </w:r>
-            <w:r>
-              <w:rPr>
-                <w:b/>
-                <w:sz w:val="18"/>
-              </w:rPr>
-              <w:t>Recibo de Prestação de Serviços</w:t>
-            </w:r>
-          </w:p>
-        </w:tc>
-        <w:tc>
-          <w:tcPr>
-            <w:tcW w:type="dxa" w:w="2929"/>
-          </w:tcPr>
-          <w:p>
-            <w:pPr>
-              <w:spacing w:after="40"/>
-              <w:jc w:val="left"/>
-            </w:pPr>
-            <w:r>
-              <w:rPr>
-                <w:sz w:val="18"/>
-              </w:rPr>
-            </w:r>
-            <w:r>
-              <w:rPr>
-                <w:b w:val="0"/>
-                <w:sz w:val="18"/>
-              </w:rPr>
-              <w:t xml:space="preserve">Assinado </w:t>
-            </w:r>
-            <w:r>
-              <w:rPr>
-                <w:b/>
-                <w:sz w:val="18"/>
-              </w:rPr>
-              <w:t>todo mês</w:t>
-            </w:r>
-            <w:r>
-              <w:rPr>
-                <w:b w:val="0"/>
-                <w:sz w:val="18"/>
-              </w:rPr>
-              <w:t>, junto com a nota fiscal</w:t>
+              <w:t>por mês</w:t>
             </w:r>
           </w:p>
         </w:tc>
@@ -415,10 +308,22 @@
           <w:color w:val="0A0A0A"/>
           <w:sz w:val="30"/>
         </w:rPr>
-        <w:t>1. TERMO DE CESSÃO DE USO DA CASA DE OPERAÇÕES</w:t>
+        <w:t>1. TERMO DE PRESTAÇÃO DE SERVIÇOS E USO DAS INSTALAÇÕES</w:t>
       </w:r>
     </w:p>
     <w:p>
+      <w:r>
+        <w:rPr>
+          <w:b/>
+        </w:rPr>
+        <w:t>CONTRATANTE:</w:t>
+      </w:r>
+      <w:r>
+        <w:rPr>
+          <w:b w:val="0"/>
+        </w:rPr>
+        <w:t xml:space="preserve"> </w:t>
+      </w:r>
       <w:r>
         <w:rPr>
           <w:b/>
@@ -429,19 +334,21 @@
         <w:rPr>
           <w:b w:val="0"/>
         </w:rPr>
-        <w:t>, CNPJ 55.493.012/0001-97, com sede na Estrada Manoel Leôncio de Souza Brito, nº 1475, Vargem Pequena, Florianópolis/SC (</w:t>
+        <w:t>, CNPJ 55.493.012/0001-97, Estrada Manoel Leôncio de Souza Brito, nº 1475, Vargem Pequena, Florianópolis/SC.</w:t>
       </w:r>
+    </w:p>
+    <w:p>
       <w:r>
         <w:rPr>
           <w:b/>
         </w:rPr>
-        <w:t>CEDENTE</w:t>
+        <w:t>PRESTADORA:</w:t>
       </w:r>
       <w:r>
         <w:rPr>
           <w:b w:val="0"/>
         </w:rPr>
-        <w:t xml:space="preserve">), e </w:t>
+        <w:t xml:space="preserve"> </w:t>
       </w:r>
       <w:r>
         <w:rPr>
@@ -465,19 +372,15 @@
         <w:rPr>
           <w:b w:val="0"/>
         </w:rPr>
-        <w:t>, RG 46.270.985-1 SSP/SP, CPF 386.386.288-03 (</w:t>
+        <w:t>, RG 46.270.985-1 SSP/SP, CPF 386.386.288-03.</w:t>
       </w:r>
-      <w:r>
-        <w:rPr>
-          <w:b/>
-        </w:rPr>
-        <w:t>CESSIONÁRIA</w:t>
-      </w:r>
+    </w:p>
+    <w:p>
       <w:r>
         <w:rPr>
           <w:b w:val="0"/>
         </w:rPr>
-        <w:t>), de comum acordo, ajustam:</w:t>
+        <w:t>As Partes, de boa-fé e de comum acordo, ajustam:</w:t>
       </w:r>
     </w:p>
     <w:p>
@@ -485,25 +388,181 @@
         <w:rPr>
           <w:b/>
         </w:rPr>
-        <w:t>1.</w:t>
+        <w:t>1. Serviços.</w:t>
       </w:r>
       <w:r>
         <w:rPr>
           <w:b w:val="0"/>
         </w:rPr>
-        <w:t xml:space="preserve"> A CEDENTE cede à CESSIONÁRIA, </w:t>
+        <w:t xml:space="preserve"> A PRESTADORA presta os </w:t>
       </w:r>
       <w:r>
         <w:rPr>
           <w:b/>
         </w:rPr>
-        <w:t>gratuitamente</w:t>
+        <w:t>serviços hoteleiros</w:t>
       </w:r>
       <w:r>
         <w:rPr>
           <w:b w:val="0"/>
         </w:rPr>
-        <w:t xml:space="preserve">, o uso da unidade denominada </w:t>
+        <w:t xml:space="preserve"> do empreendimento: recepção, check-in e check-out; atendimento ao hóspede; limpeza e arrumação das unidades e áreas comuns; enxoval; café da manhã, cortesias e bebidas; jardinagem; pequenos reparos; e zeladoria do imóvel, com guarda de chaves, ronda de conservação e comunicação de anormalidades. Cada mês os serviços são solicitados por </w:t>
+      </w:r>
+      <w:r>
+        <w:rPr>
+          <w:b/>
+        </w:rPr>
+        <w:t>Ordem de Serviço</w:t>
+      </w:r>
+      <w:r>
+        <w:rPr>
+          <w:b w:val="0"/>
+        </w:rPr>
+        <w:t xml:space="preserve"> (documento 2).</w:t>
+      </w:r>
+    </w:p>
+    <w:p>
+      <w:r>
+        <w:rPr>
+          <w:b/>
+        </w:rPr>
+        <w:t>2. Horário.</w:t>
+      </w:r>
+      <w:r>
+        <w:rPr>
+          <w:b w:val="0"/>
+        </w:rPr>
+        <w:t xml:space="preserve"> O empreendimento recebe hóspedes </w:t>
+      </w:r>
+      <w:r>
+        <w:rPr>
+          <w:b/>
+        </w:rPr>
+        <w:t>das 7h30 às 19h00, todos os dias</w:t>
+      </w:r>
+      <w:r>
+        <w:rPr>
+          <w:b w:val="0"/>
+        </w:rPr>
+        <w:t>, e a PRESTADORA mantém esse período coberto, com ao menos uma pessoa apta a atender. Um dia por semana a cobertura é feita por pessoa substituta indicada por ela, combinado entre as Partes conforme a ocupação.</w:t>
+      </w:r>
+    </w:p>
+    <w:p>
+      <w:r>
+        <w:rPr>
+          <w:b/>
+        </w:rPr>
+        <w:t>3. Organização do trabalho.</w:t>
+      </w:r>
+      <w:r>
+        <w:rPr>
+          <w:b w:val="0"/>
+        </w:rPr>
+        <w:t xml:space="preserve"> A PRESTADORA organiza a própria equipe: quem cobre cada período, o revezamento, as pausas e as substituições. A CONTRATANTE informa a programação do dia — chegadas, saídas, pedidos de hóspedes e prioridades.</w:t>
+      </w:r>
+    </w:p>
+    <w:p>
+      <w:r>
+        <w:rPr>
+          <w:b/>
+        </w:rPr>
+        <w:t>4. Sem vínculo.</w:t>
+      </w:r>
+      <w:r>
+        <w:rPr>
+          <w:b w:val="0"/>
+        </w:rPr>
+        <w:t xml:space="preserve"> Este é um ajuste </w:t>
+      </w:r>
+      <w:r>
+        <w:rPr>
+          <w:b/>
+        </w:rPr>
+        <w:t>civil, entre duas empresas</w:t>
+      </w:r>
+      <w:r>
+        <w:rPr>
+          <w:b w:val="0"/>
+        </w:rPr>
+        <w:t>. Não há vínculo empregatício entre as Partes nem entre a CONTRATANTE e as pessoas da equipe da PRESTADORA.</w:t>
+      </w:r>
+    </w:p>
+    <w:p>
+      <w:r>
+        <w:rPr>
+          <w:b/>
+        </w:rPr>
+        <w:t>5. Equipe.</w:t>
+      </w:r>
+      <w:r>
+        <w:rPr>
+          <w:b w:val="0"/>
+        </w:rPr>
+        <w:t xml:space="preserve"> A PRESTADORA é a </w:t>
+      </w:r>
+      <w:r>
+        <w:rPr>
+          <w:b/>
+        </w:rPr>
+        <w:t>empregadora</w:t>
+      </w:r>
+      <w:r>
+        <w:rPr>
+          <w:b w:val="0"/>
+        </w:rPr>
+        <w:t xml:space="preserve"> de todas as pessoas que utilizar — inclusive cônjuge ou familiar —, que devem estar formalizadas por ela, e responde pelos respectivos encargos.</w:t>
+      </w:r>
+    </w:p>
+    <w:p>
+      <w:r>
+        <w:rPr>
+          <w:b/>
+        </w:rPr>
+        <w:t>6. Valor.</w:t>
+      </w:r>
+      <w:r>
+        <w:rPr>
+          <w:b w:val="0"/>
+        </w:rPr>
+        <w:t xml:space="preserve"> </w:t>
+      </w:r>
+      <w:r>
+        <w:rPr>
+          <w:b/>
+        </w:rPr>
+        <w:t>R$ 5.000,00 (cinco mil reais) por mês</w:t>
+      </w:r>
+      <w:r>
+        <w:rPr>
+          <w:b w:val="0"/>
+        </w:rPr>
+        <w:t>, que inclui mão de obra, encargos, insumos e tributos da PRESTADORA. Pode ser revisto a qualquer tempo, de comum acordo, por escrito. Nota fiscal e recibo até o 3º dia útil; pagamento até o 5º dia útil, por PIX no CNPJ da PRESTADORA.</w:t>
+      </w:r>
+    </w:p>
+    <w:p>
+      <w:r>
+        <w:rPr>
+          <w:b/>
+        </w:rPr>
+        <w:t>7. Uso das instalações.</w:t>
+      </w:r>
+      <w:r>
+        <w:rPr>
+          <w:b w:val="0"/>
+        </w:rPr>
+        <w:t xml:space="preserve"> </w:t>
+      </w:r>
+      <w:r>
+        <w:rPr>
+          <w:b/>
+        </w:rPr>
+        <w:t>Enquanto prestar os serviços</w:t>
+      </w:r>
+      <w:r>
+        <w:rPr>
+          <w:b w:val="0"/>
+        </w:rPr>
+        <w:t xml:space="preserve">, a PRESTADORA pode usar, gratuitamente, a unidade denominada </w:t>
       </w:r>
       <w:r>
         <w:rPr>
@@ -515,33 +574,7 @@
         <w:rPr>
           <w:b w:val="0"/>
         </w:rPr>
-        <w:t xml:space="preserve">, situada no empreendimento acima, </w:t>
-      </w:r>
-      <w:r>
-        <w:rPr>
-          <w:b/>
-        </w:rPr>
-        <w:t>exclusivamente enquanto durar a prestação de serviços</w:t>
-      </w:r>
-      <w:r>
-        <w:rPr>
-          <w:b w:val="0"/>
-        </w:rPr>
-        <w:t xml:space="preserve"> entre as Partes.</w:t>
-      </w:r>
-    </w:p>
-    <w:p>
-      <w:r>
-        <w:rPr>
-          <w:b/>
-        </w:rPr>
-        <w:t>2.</w:t>
-      </w:r>
-      <w:r>
-        <w:rPr>
-          <w:b w:val="0"/>
-        </w:rPr>
-        <w:t xml:space="preserve"> A cessão é </w:t>
+        <w:t xml:space="preserve">, com energia, água e internet por conta da CONTRATANTE. O uso é </w:t>
       </w:r>
       <w:r>
         <w:rPr>
@@ -553,31 +586,7 @@
         <w:rPr>
           <w:b w:val="0"/>
         </w:rPr>
-        <w:t xml:space="preserve">, concedida </w:t>
-      </w:r>
-      <w:r>
-        <w:rPr>
-          <w:b/>
-        </w:rPr>
-        <w:t>para o trabalho</w:t>
-      </w:r>
-      <w:r>
-        <w:rPr>
-          <w:b w:val="0"/>
-        </w:rPr>
-        <w:t xml:space="preserve"> por exigir a operação presença no local, e </w:t>
-      </w:r>
-      <w:r>
-        <w:rPr>
-          <w:b/>
-        </w:rPr>
-        <w:t>não como pagamento</w:t>
-      </w:r>
-      <w:r>
-        <w:rPr>
-          <w:b w:val="0"/>
-        </w:rPr>
-        <w:t>: não é aluguel, não é remuneração, não integra o preço dos serviços e não transfere posse do imóvel.</w:t>
+        <w:t>, ligado à prestação: não é aluguel, não é remuneração e não integra o valor da Cláusula 6.</w:t>
       </w:r>
     </w:p>
     <w:p>
@@ -585,27 +594,25 @@
         <w:rPr>
           <w:b/>
         </w:rPr>
-        <w:t>3.</w:t>
+        <w:t>8. Cuidados com a unidade.</w:t>
       </w:r>
       <w:r>
         <w:rPr>
           <w:b w:val="0"/>
         </w:rPr>
-        <w:t xml:space="preserve"> Energia elétrica, água e internet correm por conta da CEDENTE, por estarem ligadas às redes do próprio empreendimento. A limpeza e a conservação interna são da CESSIONÁRIA.</w:t>
+        <w:t xml:space="preserve"> Ocupam a unidade apenas as pessoas indicadas abaixo. Não é permitido ceder ou emprestar a unidade, hospedar terceiros, fazer obras ou manter animais sem combinar antes. Melhorias ficam incorporadas ao imóvel. Na entrada e na saída é feita </w:t>
       </w:r>
-    </w:p>
-    <w:p>
       <w:r>
         <w:rPr>
           <w:b/>
         </w:rPr>
-        <w:t>4.</w:t>
+        <w:t>vistoria com fotos</w:t>
       </w:r>
       <w:r>
         <w:rPr>
           <w:b w:val="0"/>
         </w:rPr>
-        <w:t xml:space="preserve"> Ocupam a unidade apenas as pessoas abaixo indicadas. Não é permitido ceder ou emprestar a unidade, hospedar terceiros, fazer obras ou manter animais sem combinar antes. Melhorias ficam incorporadas ao imóvel, sem indenização.</w:t>
+        <w:t>, assinada pelas duas Partes.</w:t>
       </w:r>
     </w:p>
     <w:tbl>
@@ -748,95 +755,25 @@
         <w:rPr>
           <w:b/>
         </w:rPr>
-        <w:t>5.</w:t>
+        <w:t>9. Encerramento.</w:t>
       </w:r>
       <w:r>
         <w:rPr>
           <w:b w:val="0"/>
         </w:rPr>
-        <w:t xml:space="preserve"> Na entrada e na saída é feita </w:t>
+        <w:t xml:space="preserve"> Qualquer das Partes pode encerrar quando quiser, sem precisar justificar, </w:t>
       </w:r>
       <w:r>
         <w:rPr>
           <w:b/>
         </w:rPr>
-        <w:t>vistoria com fotos</w:t>
+        <w:t>avisando a outra por escrito com 30 (trinta) dias de antecedência</w:t>
       </w:r>
       <w:r>
         <w:rPr>
           <w:b w:val="0"/>
         </w:rPr>
-        <w:t>, assinada pelas duas Partes. A CESSIONÁRIA responde pelos danos além do desgaste natural.</w:t>
-      </w:r>
-    </w:p>
-    <w:p>
-      <w:r>
-        <w:rPr>
-          <w:b/>
-        </w:rPr>
-        <w:t>6.</w:t>
-      </w:r>
-      <w:r>
-        <w:rPr>
-          <w:b w:val="0"/>
-        </w:rPr>
-        <w:t xml:space="preserve"> </w:t>
-      </w:r>
-      <w:r>
-        <w:rPr>
-          <w:b/>
-        </w:rPr>
-        <w:t>Encerrada a prestação de serviços, por qualquer motivo, esta cessão termina junto</w:t>
-      </w:r>
-      <w:r>
-        <w:rPr>
-          <w:b w:val="0"/>
-        </w:rPr>
-        <w:t xml:space="preserve">, e a unidade será devolvida desocupada e em ordem, com as chaves, em </w:t>
-      </w:r>
-      <w:r>
-        <w:rPr>
-          <w:b/>
-        </w:rPr>
-        <w:t>30 (trinta) dias corridos</w:t>
-      </w:r>
-      <w:r>
-        <w:rPr>
-          <w:b w:val="0"/>
-        </w:rPr>
-        <w:t xml:space="preserve">. Passado esse prazo, é devida </w:t>
-      </w:r>
-      <w:r>
-        <w:rPr>
-          <w:b/>
-        </w:rPr>
-        <w:t>multa de R$ 100,00 por dia</w:t>
-      </w:r>
-      <w:r>
-        <w:rPr>
-          <w:b w:val="0"/>
-        </w:rPr>
-        <w:t xml:space="preserve"> até a devolução, podendo a CEDENTE retomar o imóvel judicialmente, com as despesas por conta da CESSIONÁRIA. </w:t>
-      </w:r>
-      <w:r>
-        <w:rPr>
-          <w:b/>
-        </w:rPr>
-        <w:t>Devolvida no prazo, nada é devido.</w:t>
-      </w:r>
-    </w:p>
-    <w:p>
-      <w:r>
-        <w:rPr>
-          <w:b/>
-        </w:rPr>
-        <w:t>7.</w:t>
-      </w:r>
-      <w:r>
-        <w:rPr>
-          <w:b w:val="0"/>
-        </w:rPr>
-        <w:t xml:space="preserve"> A CEDENTE pode encerrar esta cessão isoladamente, mantendo os serviços, com aviso escrito de </w:t>
+        <w:t xml:space="preserve">. Encerrada a prestação, o uso da unidade termina junto, e ela é devolvida desocupada e em ordem, com as chaves, em </w:t>
       </w:r>
       <w:r>
         <w:rPr>
@@ -848,7 +785,7 @@
         <w:rPr>
           <w:b w:val="0"/>
         </w:rPr>
-        <w:t>.</w:t>
+        <w:t>, contados em paralelo ao aviso.</w:t>
       </w:r>
     </w:p>
     <w:p>
@@ -856,7 +793,7 @@
         <w:rPr>
           <w:b/>
         </w:rPr>
-        <w:t>8.</w:t>
+        <w:t>10. Foro.</w:t>
       </w:r>
       <w:r>
         <w:rPr>
@@ -907,7 +844,7 @@
                 <w:color w:val="FFFFFF"/>
                 <w:sz w:val="18"/>
               </w:rPr>
-              <w:t>CEDENTE</w:t>
+              <w:t>CONTRATANTE</w:t>
             </w:r>
           </w:p>
         </w:tc>
@@ -933,7 +870,7 @@
                 <w:color w:val="FFFFFF"/>
                 <w:sz w:val="18"/>
               </w:rPr>
-              <w:t>CESSIONÁRIA</w:t>
+              <w:t>PRESTADORA</w:t>
             </w:r>
           </w:p>
         </w:tc>
@@ -967,6 +904,14 @@
                 <w:sz w:val="18"/>
               </w:rPr>
               <w:t>Mediterrâneo Empreendimentos Turísticos Ltda</w:t>
+              <w:br/>
+            </w:r>
+            <w:r>
+              <w:rPr>
+                <w:b w:val="0"/>
+                <w:sz w:val="18"/>
+              </w:rPr>
+              <w:t>CNPJ 55.493.012/0001-97</w:t>
             </w:r>
           </w:p>
         </w:tc>
@@ -998,6 +943,14 @@
                 <w:sz w:val="18"/>
               </w:rPr>
               <w:t>Camila Rabelo Glicerio Gois</w:t>
+              <w:br/>
+            </w:r>
+            <w:r>
+              <w:rPr>
+                <w:b w:val="0"/>
+                <w:sz w:val="18"/>
+              </w:rPr>
+              <w:t>CNPJ 19.525.600/0001-00</w:t>
             </w:r>
           </w:p>
         </w:tc>
@@ -1161,7 +1114,7 @@
           <w:color w:val="0A0A0A"/>
           <w:sz w:val="30"/>
         </w:rPr>
-        <w:t>2. ORDEM DE SERVIÇO MENSAL</w:t>
+        <w:t>2. ORDEM DE SERVIÇO E RECIBO</w:t>
       </w:r>
     </w:p>
     <w:p>
@@ -1169,19 +1122,13 @@
         <w:rPr>
           <w:b/>
         </w:rPr>
-        <w:t>Nº ______ / [____]</w:t>
+        <w:t>Competência: [____/____]</w:t>
       </w:r>
       <w:r>
         <w:rPr>
           <w:b w:val="0"/>
         </w:rPr>
-        <w:t xml:space="preserve"> — </w:t>
-      </w:r>
-      <w:r>
-        <w:rPr>
-          <w:b/>
-        </w:rPr>
-        <w:t>Competência: [____/____]</w:t>
+        <w:t xml:space="preserve"> — Ordem de Serviço nº ______</w:t>
       </w:r>
     </w:p>
     <w:p>
@@ -1224,7 +1171,7 @@
           <w:color w:val="0A0A0A"/>
           <w:sz w:val="22"/>
         </w:rPr>
-        <w:t>Serviços solicitados no período</w:t>
+        <w:t>Ordem de Serviço</w:t>
       </w:r>
     </w:p>
     <w:p>
@@ -1232,30 +1179,19 @@
         <w:rPr>
           <w:b w:val="0"/>
         </w:rPr>
-        <w:t>Serviços hoteleiros no empreendimento da CONTRATANTE: recepção, check-in e check-out; atendimento ao hóspede durante a estadia; limpeza, higienização e arrumação das unidades e áreas comuns; troca e controle de enxoval; preparo e entrega de café da manhã, cortesias e bebidas; jardinagem e conservação das áreas externas; pequenos reparos; e zeladoria do imóvel, com guarda de chaves, ronda de conservação, abertura e fechamento e comunicação de anormalidades.</w:t>
+        <w:t xml:space="preserve">Ficam solicitados, para o mês acima, os </w:t>
       </w:r>
-    </w:p>
-    <w:p>
+      <w:r>
+        <w:rPr>
+          <w:b/>
+        </w:rPr>
+        <w:t>serviços hoteleiros</w:t>
+      </w:r>
       <w:r>
         <w:rPr>
           <w:b w:val="0"/>
         </w:rPr>
-        <w:t>Não estão incluídos serviços de segurança privada (Lei nº 7.102/1983) nem os que exijam habilitação técnica ou ART.</w:t>
-      </w:r>
-    </w:p>
-    <w:p>
-      <w:pPr>
-        <w:keepNext/>
-        <w:spacing w:before="240" w:after="160"/>
-        <w:jc w:val="left"/>
-      </w:pPr>
-      <w:r>
-        <w:rPr>
-          <w:b/>
-          <w:color w:val="0A0A0A"/>
-          <w:sz w:val="22"/>
-        </w:rPr>
-        <w:t>Condições do período</w:t>
+        <w:t xml:space="preserve"> previstos no Termo de Prestação de Serviços: recepção, check-in e check-out; atendimento ao hóspede; limpeza e arrumação; enxoval; café da manhã, cortesias e bebidas; jardinagem; pequenos reparos; e zeladoria do imóvel.</w:t>
       </w:r>
     </w:p>
     <w:tbl>
@@ -1340,10 +1276,10 @@
             </w:r>
             <w:r>
               <w:rPr>
-                <w:b/>
+                <w:b w:val="0"/>
                 <w:sz w:val="18"/>
               </w:rPr>
-              <w:t>Horário de funcionamento do empreendimento</w:t>
+              <w:t>Horário de funcionamento</w:t>
             </w:r>
           </w:p>
         </w:tc>
@@ -1388,10 +1324,10 @@
             </w:r>
             <w:r>
               <w:rPr>
-                <w:b/>
+                <w:b w:val="0"/>
                 <w:sz w:val="18"/>
               </w:rPr>
-              <w:t>Cobertura</w:t>
+              <w:t>Dia de substituição no mês</w:t>
             </w:r>
           </w:p>
         </w:tc>
@@ -1414,7 +1350,7 @@
                 <w:b w:val="0"/>
                 <w:sz w:val="18"/>
               </w:rPr>
-              <w:t>A PRESTADORA mantém o período coberto, com ao menos uma pessoa apta a atender</w:t>
+              <w:t>[____________]</w:t>
             </w:r>
           </w:p>
         </w:tc>
@@ -1436,55 +1372,7 @@
             </w:r>
             <w:r>
               <w:rPr>
-                <w:b/>
-                <w:sz w:val="18"/>
-              </w:rPr>
-              <w:t>Dia de substituição</w:t>
-            </w:r>
-          </w:p>
-        </w:tc>
-        <w:tc>
-          <w:tcPr>
-            <w:tcW w:type="dxa" w:w="4394"/>
-          </w:tcPr>
-          <w:p>
-            <w:pPr>
-              <w:spacing w:after="40"/>
-              <w:jc w:val="left"/>
-            </w:pPr>
-            <w:r>
-              <w:rPr>
-                <w:sz w:val="18"/>
-              </w:rPr>
-            </w:r>
-            <w:r>
-              <w:rPr>
                 <w:b w:val="0"/>
-                <w:sz w:val="18"/>
-              </w:rPr>
-              <w:t>[____________], coberto por pessoa indicada pela PRESTADORA</w:t>
-            </w:r>
-          </w:p>
-        </w:tc>
-      </w:tr>
-      <w:tr>
-        <w:tc>
-          <w:tcPr>
-            <w:tcW w:type="dxa" w:w="4394"/>
-          </w:tcPr>
-          <w:p>
-            <w:pPr>
-              <w:spacing w:after="40"/>
-              <w:jc w:val="left"/>
-            </w:pPr>
-            <w:r>
-              <w:rPr>
-                <w:sz w:val="18"/>
-              </w:rPr>
-            </w:r>
-            <w:r>
-              <w:rPr>
-                <w:b/>
                 <w:sz w:val="18"/>
               </w:rPr>
               <w:t>Responsável pelo contato</w:t>
@@ -1532,10 +1420,10 @@
             </w:r>
             <w:r>
               <w:rPr>
-                <w:b/>
+                <w:b w:val="0"/>
                 <w:sz w:val="18"/>
               </w:rPr>
-              <w:t>Valor do período</w:t>
+              <w:t>Valor do mês</w:t>
             </w:r>
           </w:p>
         </w:tc>
@@ -1558,103 +1446,7 @@
                 <w:b w:val="0"/>
                 <w:sz w:val="18"/>
               </w:rPr>
-              <w:t>R$ 5.000,00 (cinco mil reais)</w:t>
-            </w:r>
-          </w:p>
-        </w:tc>
-      </w:tr>
-      <w:tr>
-        <w:tc>
-          <w:tcPr>
-            <w:tcW w:type="dxa" w:w="4394"/>
-          </w:tcPr>
-          <w:p>
-            <w:pPr>
-              <w:spacing w:after="40"/>
-              <w:jc w:val="left"/>
-            </w:pPr>
-            <w:r>
-              <w:rPr>
-                <w:sz w:val="18"/>
-              </w:rPr>
-            </w:r>
-            <w:r>
-              <w:rPr>
-                <w:b/>
-                <w:sz w:val="18"/>
-              </w:rPr>
-              <w:t>Nota fiscal</w:t>
-            </w:r>
-          </w:p>
-        </w:tc>
-        <w:tc>
-          <w:tcPr>
-            <w:tcW w:type="dxa" w:w="4394"/>
-          </w:tcPr>
-          <w:p>
-            <w:pPr>
-              <w:spacing w:after="40"/>
-              <w:jc w:val="left"/>
-            </w:pPr>
-            <w:r>
-              <w:rPr>
-                <w:sz w:val="18"/>
-              </w:rPr>
-            </w:r>
-            <w:r>
-              <w:rPr>
-                <w:b w:val="0"/>
-                <w:sz w:val="18"/>
-              </w:rPr>
-              <w:t>Até o 3º dia útil do mês seguinte</w:t>
-            </w:r>
-          </w:p>
-        </w:tc>
-      </w:tr>
-      <w:tr>
-        <w:tc>
-          <w:tcPr>
-            <w:tcW w:type="dxa" w:w="4394"/>
-          </w:tcPr>
-          <w:p>
-            <w:pPr>
-              <w:spacing w:after="40"/>
-              <w:jc w:val="left"/>
-            </w:pPr>
-            <w:r>
-              <w:rPr>
-                <w:sz w:val="18"/>
-              </w:rPr>
-            </w:r>
-            <w:r>
-              <w:rPr>
-                <w:b/>
-                <w:sz w:val="18"/>
-              </w:rPr>
-              <w:t>Pagamento</w:t>
-            </w:r>
-          </w:p>
-        </w:tc>
-        <w:tc>
-          <w:tcPr>
-            <w:tcW w:type="dxa" w:w="4394"/>
-          </w:tcPr>
-          <w:p>
-            <w:pPr>
-              <w:spacing w:after="40"/>
-              <w:jc w:val="left"/>
-            </w:pPr>
-            <w:r>
-              <w:rPr>
-                <w:sz w:val="18"/>
-              </w:rPr>
-            </w:r>
-            <w:r>
-              <w:rPr>
-                <w:b w:val="0"/>
-                <w:sz w:val="18"/>
-              </w:rPr>
-              <w:t>Até o 5º dia útil, por PIX no CNPJ da PRESTADORA</w:t>
+              <w:t>R$ 5.000,00</w:t>
             </w:r>
           </w:p>
         </w:tc>
@@ -1662,69 +1454,17 @@
     </w:tbl>
     <w:p/>
     <w:p>
-      <w:pPr>
-        <w:keepNext/>
-        <w:spacing w:before="240" w:after="160"/>
-        <w:jc w:val="left"/>
-      </w:pPr>
-      <w:r>
-        <w:rPr>
-          <w:b/>
-          <w:color w:val="0A0A0A"/>
-          <w:sz w:val="22"/>
-        </w:rPr>
-        <w:t>Como o serviço é organizado</w:t>
-      </w:r>
-    </w:p>
-    <w:p>
-      <w:r>
-        <w:rPr>
-          <w:b w:val="0"/>
-        </w:rPr>
-        <w:t xml:space="preserve">A PRESTADORA executa os serviços com </w:t>
-      </w:r>
       <w:r>
         <w:rPr>
           <w:b/>
         </w:rPr>
-        <w:t>equipe e organização próprias</w:t>
+        <w:t>Observações:</w:t>
       </w:r>
       <w:r>
         <w:rPr>
           <w:b w:val="0"/>
         </w:rPr>
-        <w:t>, definindo quem cobre cada período, o revezamento, as pausas e as substituições. A CONTRATANTE informa diariamente a programação do empreendimento — chegadas, saídas, pedidos de hóspedes, eventos e prioridades — ao responsável indicado.</w:t>
-      </w:r>
-    </w:p>
-    <w:p>
-      <w:r>
-        <w:rPr>
-          <w:b w:val="0"/>
-        </w:rPr>
-        <w:t>Não há vínculo empregatício entre as Partes nem entre a CONTRATANTE e as pessoas da equipe da PRESTADORA, que é a única empregadora delas e responde por seus encargos.</w:t>
-      </w:r>
-    </w:p>
-    <w:p>
-      <w:pPr>
-        <w:keepNext/>
-        <w:spacing w:before="240" w:after="160"/>
-        <w:jc w:val="left"/>
-      </w:pPr>
-      <w:r>
-        <w:rPr>
-          <w:b/>
-          <w:color w:val="0A0A0A"/>
-          <w:sz w:val="22"/>
-        </w:rPr>
-        <w:t>Observações do período</w:t>
-      </w:r>
-    </w:p>
-    <w:p>
-      <w:r>
-        <w:rPr>
-          <w:b w:val="0"/>
-        </w:rPr>
-        <w:t>_____________________________________________________________________________</w:t>
+        <w:t xml:space="preserve"> _______________________________________________________________</w:t>
       </w:r>
     </w:p>
     <w:p>
@@ -1859,38 +1599,17 @@
     </w:p>
     <w:p>
       <w:pPr>
-        <w:pBdr>
-          <w:bottom w:val="single" w:sz="6" w:color="C9A84C"/>
-        </w:pBdr>
-      </w:pPr>
-    </w:p>
-    <w:p>
-      <w:pPr>
         <w:keepNext/>
-        <w:spacing w:before="360" w:after="160"/>
-        <w:jc w:val="center"/>
+        <w:spacing w:before="240" w:after="160"/>
+        <w:jc w:val="left"/>
       </w:pPr>
       <w:r>
         <w:rPr>
           <w:b/>
           <w:color w:val="0A0A0A"/>
-          <w:sz w:val="30"/>
+          <w:sz w:val="22"/>
         </w:rPr>
-        <w:t>3. RECIBO DE PRESTAÇÃO DE SERVIÇOS</w:t>
-      </w:r>
-    </w:p>
-    <w:p>
-      <w:r>
-        <w:rPr>
-          <w:b/>
-        </w:rPr>
-        <w:t>Competência: [____/____]</w:t>
-      </w:r>
-      <w:r>
-        <w:rPr>
-          <w:b w:val="0"/>
-        </w:rPr>
-        <w:t xml:space="preserve"> — referente à Ordem de Serviço nº ______</w:t>
+        <w:t>Recibo</w:t>
       </w:r>
     </w:p>
     <w:p>
@@ -1936,13 +1655,13 @@
         <w:rPr>
           <w:b/>
         </w:rPr>
-        <w:t>R$ ______ (___________________)</w:t>
+        <w:t>R$ ______</w:t>
       </w:r>
       <w:r>
         <w:rPr>
           <w:b w:val="0"/>
         </w:rPr>
-        <w:t>, referente aos serviços prestados na competência acima, conforme nota fiscal nº ______.</w:t>
+        <w:t>, referente aos serviços da Ordem de Serviço acima, conforme nota fiscal nº ______.</w:t>
       </w:r>
     </w:p>
     <w:p>
@@ -1968,7 +1687,7 @@
         <w:rPr>
           <w:b w:val="0"/>
         </w:rPr>
-        <w:t>, sem subordinação, sem pessoalidade e sem exclusividade, não havendo vínculo empregatício entre as Partes.</w:t>
+        <w:t>, sem vínculo empregatício entre as Partes.</w:t>
       </w:r>
     </w:p>
     <w:p>
@@ -2072,7 +1791,7 @@
                 <w:color w:val="FFFFFF"/>
                 <w:sz w:val="18"/>
               </w:rPr>
-              <w:t>Vínculo com a PRESTADORA</w:t>
+              <w:t>Vínculo</w:t>
             </w:r>
           </w:p>
         </w:tc>
@@ -2204,19 +1923,7 @@
         <w:rPr>
           <w:b w:val="0"/>
         </w:rPr>
-        <w:t xml:space="preserve"> A PRESTADORA está </w:t>
-      </w:r>
-      <w:r>
-        <w:rPr>
-          <w:b/>
-        </w:rPr>
-        <w:t>em dia</w:t>
-      </w:r>
-      <w:r>
-        <w:rPr>
-          <w:b w:val="0"/>
-        </w:rPr>
-        <w:t xml:space="preserve"> com as obrigações trabalhistas, previdenciárias e fiscais do período, inclusive quanto às pessoas acima, e responde integralmente por elas.</w:t>
+        <w:t xml:space="preserve"> A PRESTADORA está em dia com as obrigações trabalhistas, previdenciárias e fiscais do período.</w:t>
       </w:r>
     </w:p>
     <w:p>
@@ -2242,7 +1949,7 @@
         <w:rPr>
           <w:b w:val="0"/>
         </w:rPr>
-        <w:t xml:space="preserve"> do valor acima, sendo ferramenta de trabalho cedida gratuitamente, nos termos do Termo de Cessão de Uso.</w:t>
+        <w:t xml:space="preserve"> do valor acima, sendo ferramenta de trabalho cedida gratuitamente.</w:t>
       </w:r>
     </w:p>
     <w:p>
@@ -2256,19 +1963,19 @@
         <w:rPr>
           <w:b w:val="0"/>
         </w:rPr>
-        <w:t xml:space="preserve"> Com este recebimento, a PRESTADORA dá </w:t>
+        <w:t xml:space="preserve"> Com este recebimento, dá </w:t>
       </w:r>
       <w:r>
         <w:rPr>
           <w:b/>
         </w:rPr>
-        <w:t>plena, geral e irrevogável quitação</w:t>
+        <w:t>quitação plena</w:t>
       </w:r>
       <w:r>
         <w:rPr>
           <w:b w:val="0"/>
         </w:rPr>
-        <w:t xml:space="preserve"> quanto à competência acima, nada mais tendo a reclamar em relação a este período.</w:t>
+        <w:t xml:space="preserve"> do mês, nada mais tendo a reclamar quanto a este período.</w:t>
       </w:r>
     </w:p>
     <w:p>
@@ -2341,19 +2048,19 @@
         <w:rPr>
           <w:b w:val="0"/>
         </w:rPr>
-        <w:t xml:space="preserve"> assinem o </w:t>
+        <w:t xml:space="preserve"> assinar o </w:t>
       </w:r>
       <w:r>
         <w:rPr>
           <w:b/>
         </w:rPr>
-        <w:t>Termo de Cessão de Uso</w:t>
+        <w:t>Termo</w:t>
       </w:r>
       <w:r>
         <w:rPr>
           <w:b w:val="0"/>
         </w:rPr>
-        <w:t xml:space="preserve"> (documento 1), com duas testemunhas, e façam a vistoria com fotos datadas.</w:t>
+        <w:t xml:space="preserve"> (documento 1), com duas testemunhas, e fazer a vistoria da unidade com fotos datadas.</w:t>
       </w:r>
     </w:p>
     <w:p>
@@ -2363,17 +2070,11 @@
         </w:rPr>
         <w:t>Todo mês:</w:t>
       </w:r>
-    </w:p>
-    <w:p>
-      <w:pPr>
-        <w:pStyle w:val="ListNumber"/>
-        <w:spacing w:after="60"/>
-      </w:pPr>
       <w:r>
         <w:rPr>
           <w:b w:val="0"/>
         </w:rPr>
-        <w:t xml:space="preserve">No início do mês, emitir a </w:t>
+        <w:t xml:space="preserve"> emitir a </w:t>
       </w:r>
       <w:r>
         <w:rPr>
@@ -2385,67 +2086,19 @@
         <w:rPr>
           <w:b w:val="0"/>
         </w:rPr>
-        <w:t xml:space="preserve"> (documento 2), assinada pelos dois</w:t>
-      </w:r>
-    </w:p>
-    <w:p>
-      <w:pPr>
-        <w:pStyle w:val="ListNumber"/>
-        <w:spacing w:after="60"/>
-      </w:pPr>
-      <w:r>
-        <w:rPr>
-          <w:b w:val="0"/>
-        </w:rPr>
-        <w:t xml:space="preserve">Até o 3º dia útil do mês seguinte, ela entrega a </w:t>
+        <w:t xml:space="preserve"> no início do mês, e ela assina o </w:t>
       </w:r>
       <w:r>
         <w:rPr>
           <w:b/>
         </w:rPr>
-        <w:t>nota fiscal</w:t>
+        <w:t>Recibo</w:t>
       </w:r>
       <w:r>
         <w:rPr>
           <w:b w:val="0"/>
         </w:rPr>
-        <w:t xml:space="preserve">, o </w:t>
-      </w:r>
-      <w:r>
-        <w:rPr>
-          <w:b/>
-        </w:rPr>
-        <w:t>recibo</w:t>
-      </w:r>
-      <w:r>
-        <w:rPr>
-          <w:b w:val="0"/>
-        </w:rPr>
-        <w:t xml:space="preserve"> (documento 3) e as certidões CND, FGTS e CNDT</w:t>
-      </w:r>
-    </w:p>
-    <w:p>
-      <w:pPr>
-        <w:pStyle w:val="ListNumber"/>
-        <w:spacing w:after="60"/>
-      </w:pPr>
-      <w:r>
-        <w:rPr>
-          <w:b w:val="0"/>
-        </w:rPr>
-        <w:t>Até o 5º dia útil, pagamento por PIX no CNPJ dela</w:t>
-      </w:r>
-    </w:p>
-    <w:p>
-      <w:pPr>
-        <w:pStyle w:val="ListNumber"/>
-        <w:spacing w:after="60"/>
-      </w:pPr>
-      <w:r>
-        <w:rPr>
-          <w:b w:val="0"/>
-        </w:rPr>
-        <w:t>Arquivar os quatro papéis juntos, numa pasta por competência: OS + nota + recibo + comprovante</w:t>
+        <w:t xml:space="preserve"> ao receber. Arquivar a folha junto com a nota fiscal e o comprovante do PIX, numa pasta por mês.</w:t>
       </w:r>
     </w:p>
     <w:sectPr>

</xml_diff>

<commit_message>
Remove a vistoria da unidade do termo
O uso das instalações fica descrito apenas pelo essencial: quem ocupa,
a proibição de ceder a terceiros ou fazer obras sem combinar, e a
incorporação de melhorias ao imóvel.

Co-Authored-By: Claude Opus 5 <noreply@anthropic.com>
Claude-Session: https://claude.ai/code/session_01JvuJwy7yY4EnoYMkQynCaG
</commit_message>
<xml_diff>
--- a/docs/juridico/kit-mensal-simplificado.docx
+++ b/docs/juridico/kit-mensal-simplificado.docx
@@ -600,19 +600,7 @@
         <w:rPr>
           <w:b w:val="0"/>
         </w:rPr>
-        <w:t xml:space="preserve"> Ocupam a unidade apenas as pessoas indicadas abaixo. Não é permitido ceder ou emprestar a unidade, hospedar terceiros, fazer obras ou manter animais sem combinar antes. Melhorias ficam incorporadas ao imóvel. Na entrada e na saída é feita </w:t>
-      </w:r>
-      <w:r>
-        <w:rPr>
-          <w:b/>
-        </w:rPr>
-        <w:t>vistoria com fotos</w:t>
-      </w:r>
-      <w:r>
-        <w:rPr>
-          <w:b w:val="0"/>
-        </w:rPr>
-        <w:t>, assinada pelas duas Partes.</w:t>
+        <w:t xml:space="preserve"> Ocupam a unidade apenas as pessoas indicadas abaixo. Não é permitido ceder ou emprestar a unidade a terceiros, nem fazer obras, sem combinar antes. Melhorias ficam incorporadas ao imóvel.</w:t>
       </w:r>
     </w:p>
     <w:tbl>
@@ -2060,7 +2048,7 @@
         <w:rPr>
           <w:b w:val="0"/>
         </w:rPr>
-        <w:t xml:space="preserve"> (documento 1), com duas testemunhas, e fazer a vistoria da unidade com fotos datadas.</w:t>
+        <w:t xml:space="preserve"> (documento 1), com duas testemunhas.</w:t>
       </w:r>
     </w:p>
     <w:p>

</xml_diff>

<commit_message>
Atrela o serviço à ocupação, no lugar do horário fixo
O empreendimento opera por reserva, como uma hospedagem de temporada:
há dias sem ocupação e sem serviço, e a remuneração é a mesma. Descrever
o serviço por horário de funcionamento não correspondia a isso.

- O serviço passa a seguir a ocupação: preparação da unidade, recepção,
  atendimento durante a estadia, check-out e limpeza, a cada reserva.
- Fica registrado que em dias sem ocupação e sem serviço programado não
  há serviço a prestar.
- Os horários remanescentes são os de check-in e check-out, que são
  política do empreendimento dirigida ao hóspede.
- Removido o dia de substituição semanal, que só fazia sentido na
  lógica de cobertura contínua.
- Ordem de Serviço passa a registrar as reservas previstas no mês.

Co-Authored-By: Claude Opus 5 <noreply@anthropic.com>
Claude-Session: https://claude.ai/code/session_01JvuJwy7yY4EnoYMkQynCaG
</commit_message>
<xml_diff>
--- a/docs/juridico/kit-mensal-simplificado.docx
+++ b/docs/juridico/kit-mensal-simplificado.docx
@@ -426,25 +426,61 @@
         <w:rPr>
           <w:b/>
         </w:rPr>
-        <w:t>2. Horário.</w:t>
+        <w:t>2. Como o serviço acontece.</w:t>
       </w:r>
       <w:r>
         <w:rPr>
           <w:b w:val="0"/>
         </w:rPr>
-        <w:t xml:space="preserve"> O empreendimento recebe hóspedes </w:t>
+        <w:t xml:space="preserve"> Os serviços seguem a </w:t>
       </w:r>
       <w:r>
         <w:rPr>
           <w:b/>
         </w:rPr>
-        <w:t>das 7h30 às 19h00, todos os dias</w:t>
+        <w:t>ocupação do empreendimento</w:t>
       </w:r>
       <w:r>
         <w:rPr>
           <w:b w:val="0"/>
         </w:rPr>
-        <w:t>, e a PRESTADORA mantém esse período coberto, com ao menos uma pessoa apta a atender. Um dia por semana a cobertura é feita por pessoa substituta indicada por ela, combinado entre as Partes conforme a ocupação.</w:t>
+        <w:t xml:space="preserve">: a cada reserva, a PRESTADORA prepara a unidade antes da chegada, recebe o hóspede, atende durante a estadia e faz o check-out e a limpeza depois. </w:t>
+      </w:r>
+      <w:r>
+        <w:rPr>
+          <w:b/>
+        </w:rPr>
+        <w:t>Nos dias sem ocupação e sem serviço programado, não há serviço a prestar.</w:t>
+      </w:r>
+      <w:r>
+        <w:rPr>
+          <w:b w:val="0"/>
+        </w:rPr>
+        <w:t xml:space="preserve"> O horário de chegada e de saída dos hóspedes segue a política do empreendimento — check-in a partir das </w:t>
+      </w:r>
+      <w:r>
+        <w:rPr>
+          <w:b/>
+        </w:rPr>
+        <w:t>[__]h</w:t>
+      </w:r>
+      <w:r>
+        <w:rPr>
+          <w:b w:val="0"/>
+        </w:rPr>
+        <w:t xml:space="preserve"> e check-out até as </w:t>
+      </w:r>
+      <w:r>
+        <w:rPr>
+          <w:b/>
+        </w:rPr>
+        <w:t>[__]h</w:t>
+      </w:r>
+      <w:r>
+        <w:rPr>
+          <w:b w:val="0"/>
+        </w:rPr>
+        <w:t xml:space="preserve"> —, que é regra para o hóspede.</w:t>
       </w:r>
     </w:p>
     <w:p>
@@ -458,7 +494,7 @@
         <w:rPr>
           <w:b w:val="0"/>
         </w:rPr>
-        <w:t xml:space="preserve"> A PRESTADORA organiza a própria equipe: quem cobre cada período, o revezamento, as pausas e as substituições. A CONTRATANTE informa a programação do dia — chegadas, saídas, pedidos de hóspedes e prioridades.</w:t>
+        <w:t xml:space="preserve"> A PRESTADORA organiza a própria equipe: quem atende cada reserva, o revezamento, as pausas e as substituições. A CONTRATANTE informa as reservas e a programação — chegadas, saídas, pedidos de hóspedes e prioridades.</w:t>
       </w:r>
     </w:p>
     <w:p>
@@ -1179,7 +1215,19 @@
         <w:rPr>
           <w:b w:val="0"/>
         </w:rPr>
-        <w:t xml:space="preserve"> previstos no Termo de Prestação de Serviços: recepção, check-in e check-out; atendimento ao hóspede; limpeza e arrumação; enxoval; café da manhã, cortesias e bebidas; jardinagem; pequenos reparos; e zeladoria do imóvel.</w:t>
+        <w:t xml:space="preserve"> previstos no Termo, </w:t>
+      </w:r>
+      <w:r>
+        <w:rPr>
+          <w:b/>
+        </w:rPr>
+        <w:t>conforme a ocupação do empreendimento</w:t>
+      </w:r>
+      <w:r>
+        <w:rPr>
+          <w:b w:val="0"/>
+        </w:rPr>
+        <w:t>: preparação da unidade antes de cada chegada; recepção, check-in e check-out; atendimento ao hóspede durante a estadia; limpeza, arrumação e enxoval; café da manhã, cortesias e bebidas; jardinagem; pequenos reparos; e zeladoria do imóvel.</w:t>
       </w:r>
     </w:p>
     <w:tbl>
@@ -1267,7 +1315,7 @@
                 <w:b w:val="0"/>
                 <w:sz w:val="18"/>
               </w:rPr>
-              <w:t>Horário de funcionamento</w:t>
+              <w:t>Reservas previstas no mês</w:t>
             </w:r>
           </w:p>
         </w:tc>
@@ -1290,7 +1338,7 @@
                 <w:b w:val="0"/>
                 <w:sz w:val="18"/>
               </w:rPr>
-              <w:t>7h30 às 19h00, todos os dias</w:t>
+              <w:t>[____]</w:t>
             </w:r>
           </w:p>
         </w:tc>
@@ -1315,7 +1363,7 @@
                 <w:b w:val="0"/>
                 <w:sz w:val="18"/>
               </w:rPr>
-              <w:t>Dia de substituição no mês</w:t>
+              <w:t>Check-in / check-out</w:t>
             </w:r>
           </w:p>
         </w:tc>
@@ -1338,7 +1386,7 @@
                 <w:b w:val="0"/>
                 <w:sz w:val="18"/>
               </w:rPr>
-              <w:t>[____________]</w:t>
+              <w:t>a partir das [__]h / até as [__]h</w:t>
             </w:r>
           </w:p>
         </w:tc>

</xml_diff>

<commit_message>
Afasta a disponibilidade permanente decorrente da moradia
Residir na unidade é, por si, o indício mais forte de estar sempre à
disposição. O item 7 passa a registrar que morar no local não significa
disponibilidade: fora dos serviços decorrentes da ocupação, a Prestadora
e sua equipe não ficam à disposição da Contratante.

Co-Authored-By: Claude Opus 5 <noreply@anthropic.com>
Claude-Session: https://claude.ai/code/session_01JvuJwy7yY4EnoYMkQynCaG
</commit_message>
<xml_diff>
--- a/docs/juridico/kit-mensal-simplificado.docx
+++ b/docs/juridico/kit-mensal-simplificado.docx
@@ -622,7 +622,19 @@
         <w:rPr>
           <w:b w:val="0"/>
         </w:rPr>
-        <w:t>, ligado à prestação: não é aluguel, não é remuneração e não integra o valor da Cláusula 6.</w:t>
+        <w:t xml:space="preserve">, ligado à prestação: não é aluguel, não é remuneração e não integra o valor da Cláusula 6. </w:t>
+      </w:r>
+      <w:r>
+        <w:rPr>
+          <w:b/>
+        </w:rPr>
+        <w:t>Morar na unidade não significa estar à disposição:</w:t>
+      </w:r>
+      <w:r>
+        <w:rPr>
+          <w:b w:val="0"/>
+        </w:rPr>
+        <w:t xml:space="preserve"> fora dos serviços decorrentes da ocupação, a PRESTADORA e sua equipe não ficam à disposição da CONTRATANTE.</w:t>
       </w:r>
     </w:p>
     <w:p>

</xml_diff>

<commit_message>
Reduz os prazos de encerramento para 15 dias
Aviso de encerramento e devolução da unidade passam de 30 para 15 dias,
mantidos em paralelo, de modo que a saída se conclua em duas semanas.

Co-Authored-By: Claude Opus 5 <noreply@anthropic.com>
Claude-Session: https://claude.ai/code/session_01JvuJwy7yY4EnoYMkQynCaG
</commit_message>
<xml_diff>
--- a/docs/juridico/kit-mensal-simplificado.docx
+++ b/docs/juridico/kit-mensal-simplificado.docx
@@ -803,7 +803,7 @@
         <w:rPr>
           <w:b/>
         </w:rPr>
-        <w:t>avisando a outra por escrito com 30 (trinta) dias de antecedência</w:t>
+        <w:t>avisando a outra por escrito com 15 (quinze) dias de antecedência</w:t>
       </w:r>
       <w:r>
         <w:rPr>
@@ -815,7 +815,7 @@
         <w:rPr>
           <w:b/>
         </w:rPr>
-        <w:t>30 (trinta) dias</w:t>
+        <w:t>15 (quinze) dias</w:t>
       </w:r>
       <w:r>
         <w:rPr>

</xml_diff>

<commit_message>
Reescreve o acordo em torno das tarefas e da ordem de serviço
Sai a descrição de horários e de organização da cobertura; entra a lista
do que efetivamente é feito.

- Item 2 lista as tarefas, executadas conforme a ocupação: preparar a
  unidade, receber o hóspede, atender a estadia, check-out e limpeza,
  áreas comuns, enxoval, café da manhã, jardim, pequenos reparos e
  zeladoria do imóvel.
- Item 3 define a Ordem de Serviço mensal como o instrumento que
  solicita os serviços do período.
- Removidos os horários de funcionamento e de check-in e check-out.
- Uso das instalações fica vinculado à vigência da prestação, com a
  ressalva de que morar na unidade não significa estar à disposição.
- Ordem de Serviço passa a ter campo para tarefas adicionais do mês.

Co-Authored-By: Claude Opus 5 <noreply@anthropic.com>
Claude-Session: https://claude.ai/code/session_01JvuJwy7yY4EnoYMkQynCaG
</commit_message>
<xml_diff>
--- a/docs/juridico/kit-mensal-simplificado.docx
+++ b/docs/juridico/kit-mensal-simplificado.docx
@@ -167,7 +167,7 @@
                 <w:b/>
                 <w:sz w:val="18"/>
               </w:rPr>
-              <w:t>Termo de Prestação de Serviços e Uso das Instalações</w:t>
+              <w:t>Acordo de Prestação de Serviços</w:t>
             </w:r>
           </w:p>
         </w:tc>
@@ -308,7 +308,7 @@
           <w:color w:val="0A0A0A"/>
           <w:sz w:val="30"/>
         </w:rPr>
-        <w:t>1. TERMO DE PRESTAÇÃO DE SERVIÇOS E USO DAS INSTALAÇÕES</w:t>
+        <w:t>1. ACORDO DE PRESTAÇÃO DE SERVIÇOS</w:t>
       </w:r>
     </w:p>
     <w:p>
@@ -388,7 +388,7 @@
         <w:rPr>
           <w:b/>
         </w:rPr>
-        <w:t>1. Serviços.</w:t>
+        <w:t>1. Objeto.</w:t>
       </w:r>
       <w:r>
         <w:rPr>
@@ -406,7 +406,7 @@
         <w:rPr>
           <w:b w:val="0"/>
         </w:rPr>
-        <w:t xml:space="preserve"> do empreendimento: recepção, check-in e check-out; atendimento ao hóspede; limpeza e arrumação das unidades e áreas comuns; enxoval; café da manhã, cortesias e bebidas; jardinagem; pequenos reparos; e zeladoria do imóvel, com guarda de chaves, ronda de conservação e comunicação de anormalidades. Cada mês os serviços são solicitados por </w:t>
+        <w:t xml:space="preserve"> do empreendimento da CONTRATANTE, solicitados a cada mês por </w:t>
       </w:r>
       <w:r>
         <w:rPr>
@@ -418,7 +418,7 @@
         <w:rPr>
           <w:b w:val="0"/>
         </w:rPr>
-        <w:t xml:space="preserve"> (documento 2).</w:t>
+        <w:t>.</w:t>
       </w:r>
     </w:p>
     <w:p>
@@ -426,61 +426,141 @@
         <w:rPr>
           <w:b/>
         </w:rPr>
-        <w:t>2. Como o serviço acontece.</w:t>
+        <w:t>2. Tarefas.</w:t>
       </w:r>
       <w:r>
         <w:rPr>
           <w:b w:val="0"/>
         </w:rPr>
-        <w:t xml:space="preserve"> Os serviços seguem a </w:t>
+        <w:t xml:space="preserve"> Conforme a ocupação do empreendimento:</w:t>
       </w:r>
-      <w:r>
-        <w:rPr>
-          <w:b/>
-        </w:rPr>
-        <w:t>ocupação do empreendimento</w:t>
-      </w:r>
+    </w:p>
+    <w:p>
+      <w:pPr>
+        <w:pStyle w:val="ListBullet"/>
+        <w:spacing w:after="60"/>
+      </w:pPr>
       <w:r>
         <w:rPr>
           <w:b w:val="0"/>
         </w:rPr>
-        <w:t xml:space="preserve">: a cada reserva, a PRESTADORA prepara a unidade antes da chegada, recebe o hóspede, atende durante a estadia e faz o check-out e a limpeza depois. </w:t>
+        <w:t>preparar a unidade antes de cada chegada;</w:t>
       </w:r>
-      <w:r>
-        <w:rPr>
-          <w:b/>
-        </w:rPr>
-        <w:t>Nos dias sem ocupação e sem serviço programado, não há serviço a prestar.</w:t>
-      </w:r>
+    </w:p>
+    <w:p>
+      <w:pPr>
+        <w:pStyle w:val="ListBullet"/>
+        <w:spacing w:after="60"/>
+      </w:pPr>
       <w:r>
         <w:rPr>
           <w:b w:val="0"/>
         </w:rPr>
-        <w:t xml:space="preserve"> O horário de chegada e de saída dos hóspedes segue a política do empreendimento — check-in a partir das </w:t>
+        <w:t>receber o hóspede e fazer o check-in;</w:t>
       </w:r>
-      <w:r>
-        <w:rPr>
-          <w:b/>
-        </w:rPr>
-        <w:t>[__]h</w:t>
-      </w:r>
+    </w:p>
+    <w:p>
+      <w:pPr>
+        <w:pStyle w:val="ListBullet"/>
+        <w:spacing w:after="60"/>
+      </w:pPr>
       <w:r>
         <w:rPr>
           <w:b w:val="0"/>
         </w:rPr>
-        <w:t xml:space="preserve"> e check-out até as </w:t>
+        <w:t>atender o hóspede durante a estadia;</w:t>
       </w:r>
-      <w:r>
-        <w:rPr>
-          <w:b/>
-        </w:rPr>
-        <w:t>[__]h</w:t>
-      </w:r>
+    </w:p>
+    <w:p>
+      <w:pPr>
+        <w:pStyle w:val="ListBullet"/>
+        <w:spacing w:after="60"/>
+      </w:pPr>
       <w:r>
         <w:rPr>
           <w:b w:val="0"/>
         </w:rPr>
-        <w:t xml:space="preserve"> —, que é regra para o hóspede.</w:t>
+        <w:t>fazer o check-out e a limpeza da unidade;</w:t>
+      </w:r>
+    </w:p>
+    <w:p>
+      <w:pPr>
+        <w:pStyle w:val="ListBullet"/>
+        <w:spacing w:after="60"/>
+      </w:pPr>
+      <w:r>
+        <w:rPr>
+          <w:b w:val="0"/>
+        </w:rPr>
+        <w:t>limpar e higienizar as unidades e as áreas comuns;</w:t>
+      </w:r>
+    </w:p>
+    <w:p>
+      <w:pPr>
+        <w:pStyle w:val="ListBullet"/>
+        <w:spacing w:after="60"/>
+      </w:pPr>
+      <w:r>
+        <w:rPr>
+          <w:b w:val="0"/>
+        </w:rPr>
+        <w:t>trocar e controlar o enxoval;</w:t>
+      </w:r>
+    </w:p>
+    <w:p>
+      <w:pPr>
+        <w:pStyle w:val="ListBullet"/>
+        <w:spacing w:after="60"/>
+      </w:pPr>
+      <w:r>
+        <w:rPr>
+          <w:b w:val="0"/>
+        </w:rPr>
+        <w:t>preparar e entregar café da manhã, cortesias e bebidas;</w:t>
+      </w:r>
+    </w:p>
+    <w:p>
+      <w:pPr>
+        <w:pStyle w:val="ListBullet"/>
+        <w:spacing w:after="60"/>
+      </w:pPr>
+      <w:r>
+        <w:rPr>
+          <w:b w:val="0"/>
+        </w:rPr>
+        <w:t>cuidar do jardim e das áreas externas;</w:t>
+      </w:r>
+    </w:p>
+    <w:p>
+      <w:pPr>
+        <w:pStyle w:val="ListBullet"/>
+        <w:spacing w:after="60"/>
+      </w:pPr>
+      <w:r>
+        <w:rPr>
+          <w:b w:val="0"/>
+        </w:rPr>
+        <w:t>fazer pequenos reparos;</w:t>
+      </w:r>
+    </w:p>
+    <w:p>
+      <w:pPr>
+        <w:pStyle w:val="ListBullet"/>
+        <w:spacing w:after="60"/>
+      </w:pPr>
+      <w:r>
+        <w:rPr>
+          <w:b w:val="0"/>
+        </w:rPr>
+        <w:t>zelar pelo imóvel: guarda de chaves, ronda de conservação, abertura e fechamento e comunicação de anormalidades.</w:t>
+      </w:r>
+    </w:p>
+    <w:p>
+      <w:r>
+        <w:rPr>
+          <w:b w:val="0"/>
+        </w:rPr>
+        <w:t>Não estão incluídos serviços de segurança privada nem os que exijam habilitação técnica ou ART.</w:t>
       </w:r>
     </w:p>
     <w:p>
@@ -488,13 +568,13 @@
         <w:rPr>
           <w:b/>
         </w:rPr>
-        <w:t>3. Organização do trabalho.</w:t>
+        <w:t>3. Ordem de Serviço.</w:t>
       </w:r>
       <w:r>
         <w:rPr>
           <w:b w:val="0"/>
         </w:rPr>
-        <w:t xml:space="preserve"> A PRESTADORA organiza a própria equipe: quem atende cada reserva, o revezamento, as pausas e as substituições. A CONTRATANTE informa as reservas e a programação — chegadas, saídas, pedidos de hóspedes e prioridades.</w:t>
+        <w:t xml:space="preserve"> A cada mês a CONTRATANTE emite a Ordem de Serviço do período, e a PRESTADORA assina de acordo. A CONTRATANTE informa as reservas e as prioridades; a PRESTADORA organiza a própria equipe e executa.</w:t>
       </w:r>
     </w:p>
     <w:p>
@@ -592,7 +672,7 @@
         <w:rPr>
           <w:b/>
         </w:rPr>
-        <w:t>Enquanto prestar os serviços</w:t>
+        <w:t>Enquanto vigorar a prestação dos serviços</w:t>
       </w:r>
       <w:r>
         <w:rPr>
@@ -622,19 +702,7 @@
         <w:rPr>
           <w:b w:val="0"/>
         </w:rPr>
-        <w:t xml:space="preserve">, ligado à prestação: não é aluguel, não é remuneração e não integra o valor da Cláusula 6. </w:t>
-      </w:r>
-      <w:r>
-        <w:rPr>
-          <w:b/>
-        </w:rPr>
-        <w:t>Morar na unidade não significa estar à disposição:</w:t>
-      </w:r>
-      <w:r>
-        <w:rPr>
-          <w:b w:val="0"/>
-        </w:rPr>
-        <w:t xml:space="preserve"> fora dos serviços decorrentes da ocupação, a PRESTADORA e sua equipe não ficam à disposição da CONTRATANTE.</w:t>
+        <w:t>, ligado à prestação: não é aluguel, não é remuneração e não integra o valor do item 6. Morar na unidade não significa estar à disposição da CONTRATANTE.</w:t>
       </w:r>
     </w:p>
     <w:p>
@@ -642,7 +710,7 @@
         <w:rPr>
           <w:b/>
         </w:rPr>
-        <w:t>8. Cuidados com a unidade.</w:t>
+        <w:t>8. Uso da unidade.</w:t>
       </w:r>
       <w:r>
         <w:rPr>
@@ -1215,31 +1283,7 @@
         <w:rPr>
           <w:b w:val="0"/>
         </w:rPr>
-        <w:t xml:space="preserve">Ficam solicitados, para o mês acima, os </w:t>
-      </w:r>
-      <w:r>
-        <w:rPr>
-          <w:b/>
-        </w:rPr>
-        <w:t>serviços hoteleiros</w:t>
-      </w:r>
-      <w:r>
-        <w:rPr>
-          <w:b w:val="0"/>
-        </w:rPr>
-        <w:t xml:space="preserve"> previstos no Termo, </w:t>
-      </w:r>
-      <w:r>
-        <w:rPr>
-          <w:b/>
-        </w:rPr>
-        <w:t>conforme a ocupação do empreendimento</w:t>
-      </w:r>
-      <w:r>
-        <w:rPr>
-          <w:b w:val="0"/>
-        </w:rPr>
-        <w:t>: preparação da unidade antes de cada chegada; recepção, check-in e check-out; atendimento ao hóspede durante a estadia; limpeza, arrumação e enxoval; café da manhã, cortesias e bebidas; jardinagem; pequenos reparos; e zeladoria do imóvel.</w:t>
+        <w:t>Ficam solicitadas, para o mês acima, as tarefas do item 2 do Acordo de Prestação de Serviços, conforme a ocupação do empreendimento:</w:t>
       </w:r>
     </w:p>
     <w:tbl>
@@ -1296,14 +1340,6 @@
                 <w:sz w:val="18"/>
               </w:rPr>
             </w:r>
-            <w:r>
-              <w:rPr>
-                <w:b/>
-                <w:color w:val="FFFFFF"/>
-                <w:sz w:val="18"/>
-              </w:rPr>
-              <w:t>Condição</w:t>
-            </w:r>
           </w:p>
         </w:tc>
       </w:tr>
@@ -1351,54 +1387,6 @@
                 <w:sz w:val="18"/>
               </w:rPr>
               <w:t>[____]</w:t>
-            </w:r>
-          </w:p>
-        </w:tc>
-      </w:tr>
-      <w:tr>
-        <w:tc>
-          <w:tcPr>
-            <w:tcW w:type="dxa" w:w="4394"/>
-          </w:tcPr>
-          <w:p>
-            <w:pPr>
-              <w:spacing w:after="40"/>
-              <w:jc w:val="left"/>
-            </w:pPr>
-            <w:r>
-              <w:rPr>
-                <w:sz w:val="18"/>
-              </w:rPr>
-            </w:r>
-            <w:r>
-              <w:rPr>
-                <w:b w:val="0"/>
-                <w:sz w:val="18"/>
-              </w:rPr>
-              <w:t>Check-in / check-out</w:t>
-            </w:r>
-          </w:p>
-        </w:tc>
-        <w:tc>
-          <w:tcPr>
-            <w:tcW w:type="dxa" w:w="4394"/>
-          </w:tcPr>
-          <w:p>
-            <w:pPr>
-              <w:spacing w:after="40"/>
-              <w:jc w:val="left"/>
-            </w:pPr>
-            <w:r>
-              <w:rPr>
-                <w:sz w:val="18"/>
-              </w:rPr>
-            </w:r>
-            <w:r>
-              <w:rPr>
-                <w:b w:val="0"/>
-                <w:sz w:val="18"/>
-              </w:rPr>
-              <w:t>a partir das [__]h / até as [__]h</w:t>
             </w:r>
           </w:p>
         </w:tc>
@@ -1506,13 +1494,23 @@
         <w:rPr>
           <w:b/>
         </w:rPr>
-        <w:t>Observações:</w:t>
+        <w:t>Tarefas ou observações adicionais do período:</w:t>
       </w:r>
+    </w:p>
+    <w:p>
       <w:r>
         <w:rPr>
           <w:b w:val="0"/>
         </w:rPr>
-        <w:t xml:space="preserve"> _______________________________________________________________</w:t>
+        <w:t>_____________________________________________________________________________</w:t>
+      </w:r>
+    </w:p>
+    <w:p>
+      <w:r>
+        <w:rPr>
+          <w:b w:val="0"/>
+        </w:rPr>
+        <w:t>_____________________________________________________________________________</w:t>
       </w:r>
     </w:p>
     <w:p>
@@ -2102,7 +2100,7 @@
         <w:rPr>
           <w:b/>
         </w:rPr>
-        <w:t>Termo</w:t>
+        <w:t>Acordo</w:t>
       </w:r>
       <w:r>
         <w:rPr>
@@ -2146,7 +2144,7 @@
         <w:rPr>
           <w:b w:val="0"/>
         </w:rPr>
-        <w:t xml:space="preserve"> ao receber. Arquivar a folha junto com a nota fiscal e o comprovante do PIX, numa pasta por mês.</w:t>
+        <w:t xml:space="preserve"> ao receber. Arquivar a folha junto com a nota fiscal e o comprovante do PIX.</w:t>
       </w:r>
     </w:p>
     <w:sectPr>

</xml_diff>

<commit_message>
Emite as ordens de serviço e recibos de junho a agosto preenchidos
Substitui o arquivo anterior, que trazia apenas recibos, por três folhas
completas, uma por mês, com a ordem de serviço e o recibo já preenchidos:
competência, escopo, responsável, valor de R$ 5.000,00 e data de emissão.
No recibo de agosto consta o identificador do PIX de 05/09/2026.

Cada folha é devolvida assinada nas duas partes, com a nota fiscal e o
comprovante do PIX anexos — exigência que passa a constar também do
modelo mensal do kit.

Co-Authored-By: Claude Opus 5 <noreply@anthropic.com>
Claude-Session: https://claude.ai/code/session_01JvuJwy7yY4EnoYMkQynCaG
</commit_message>
<xml_diff>
--- a/docs/juridico/kit-mensal-simplificado.docx
+++ b/docs/juridico/kit-mensal-simplificado.docx
@@ -2027,6 +2027,20 @@
     <w:p>
       <w:r>
         <w:rPr>
+          <w:b/>
+        </w:rPr>
+        <w:t>Anexos:</w:t>
+      </w:r>
+      <w:r>
+        <w:rPr>
+          <w:b w:val="0"/>
+        </w:rPr>
+        <w:t xml:space="preserve"> nota fiscal da competência · comprovante do PIX</w:t>
+      </w:r>
+    </w:p>
+    <w:p>
+      <w:r>
+        <w:rPr>
           <w:b w:val="0"/>
         </w:rPr>
         <w:t>Florianópolis/SC, ___ de _____________ de ______.</w:t>
@@ -2132,19 +2146,31 @@
         <w:rPr>
           <w:b w:val="0"/>
         </w:rPr>
-        <w:t xml:space="preserve"> no início do mês, e ela assina o </w:t>
+        <w:t xml:space="preserve"> no início do mês. A PRESTADORA devolve a folha assinada nas duas partes — Ordem de Serviço e Recibo —, com a </w:t>
       </w:r>
       <w:r>
         <w:rPr>
           <w:b/>
         </w:rPr>
-        <w:t>Recibo</w:t>
+        <w:t>nota fiscal</w:t>
       </w:r>
       <w:r>
         <w:rPr>
           <w:b w:val="0"/>
         </w:rPr>
-        <w:t xml:space="preserve"> ao receber. Arquivar a folha junto com a nota fiscal e o comprovante do PIX.</w:t>
+        <w:t xml:space="preserve"> e o </w:t>
+      </w:r>
+      <w:r>
+        <w:rPr>
+          <w:b/>
+        </w:rPr>
+        <w:t>comprovante do PIX</w:t>
+      </w:r>
+      <w:r>
+        <w:rPr>
+          <w:b w:val="0"/>
+        </w:rPr>
+        <w:t xml:space="preserve"> anexos. Arquivar tudo junto, numa pasta por competência.</w:t>
       </w:r>
     </w:p>
     <w:sectPr>

</xml_diff>